<commit_message>
Record the I17 Case 3 figure swap and regenerate its edit doc
Co-Authored-By: Claude Fable 5.1 <noreply@anthropic.com>
</commit_message>
<xml_diff>
--- a/Module Edit Docs/I17 - Edit Doc.docx
+++ b/Module Edit Docs/I17 - Edit Doc.docx
@@ -28,7 +28,7 @@
           <w:color w:val="B00000"/>
           <w:sz w:val="21"/>
         </w:rPr>
-        <w:t>ISSUES FLAGGED FOR THIS MODULE (7)</w:t>
+        <w:t>ISSUES FLAGGED FOR THIS MODULE (8)</w:t>
       </w:r>
     </w:p>
     <w:p>
@@ -109,6 +109,16 @@
           <w:sz w:val="19"/>
         </w:rPr>
         <w:t>[NOTE: Resolved 2026-09-13 (figure pass): the three images pasted into the edit doc (Case 1, 3, 6 figure slots) are now all placed on the page, each as its own figure immediately after the existing SVG, per Neal's rule not to leave out a pasted figure. img/i17-same-cvp- two-patients-gustavo.jpg (Case 1, the same transmural decomposition with illustrated RV filling, "underfilled/overfilled" framed as qualitative in the caption, not asserted as measured). img/i17-abdominal-pressure-venous-return-gustavo.jpg (Case 3, an anatomically detailed version of the existing diaphragm/IVC schematic, labelled P_RA/P_msf, glossed in caption as RAP/Pms). img/i15-large-v-wave-gustavo.jpg (Case 6, the same PA-vs-wedge trace comparison used in I15, with the discriminating features called out on the trace). All three captioned "Drawn by Gustavo Garc&amp;iacute;a Ch&amp;aacute;vez for this module." Supersedes the prior DECISION on this point.]</w:t>
+      </w:r>
+    </w:p>
+    <w:p>
+      <w:r>
+        <w:rPr>
+          <w:i/>
+          <w:color w:val="5A5A5A"/>
+          <w:sz w:val="19"/>
+        </w:rPr>
+        <w:t>[NOTE: On Neal's instruction of 2026-09-13 the Case 3 SVG redraw was removed and Gustavo's original abdominal pressure figure is the only Case 3 figure, carrying the explanatory caption and the P_RA and P_msf note.]</w:t>
       </w:r>
     </w:p>
     <w:p/>
@@ -504,63 +514,8 @@
       <w:r>
         <w:drawing>
           <wp:inline xmlns:a="http://schemas.openxmlformats.org/drawingml/2006/main" xmlns:pic="http://schemas.openxmlformats.org/drawingml/2006/picture">
-            <wp:extent cx="2834640" cy="2834640"/>
+            <wp:extent cx="2834640" cy="1461864"/>
             <wp:docPr id="4" name="Picture 4"/>
-            <wp:cNvGraphicFramePr>
-              <a:graphicFrameLocks noChangeAspect="1"/>
-            </wp:cNvGraphicFramePr>
-            <a:graphic>
-              <a:graphicData uri="http://schemas.openxmlformats.org/drawingml/2006/picture">
-                <pic:pic>
-                  <pic:nvPicPr>
-                    <pic:cNvPr id="0" name="i17-abdominal-pressure-venous-return.svg.png"/>
-                    <pic:cNvPicPr/>
-                  </pic:nvPicPr>
-                  <pic:blipFill>
-                    <a:blip r:embed="rId12"/>
-                    <a:stretch>
-                      <a:fillRect/>
-                    </a:stretch>
-                  </pic:blipFill>
-                  <pic:spPr>
-                    <a:xfrm>
-                      <a:off x="0" y="0"/>
-                      <a:ext cx="2834640" cy="2834640"/>
-                    </a:xfrm>
-                    <a:prstGeom prst="rect"/>
-                  </pic:spPr>
-                </pic:pic>
-              </a:graphicData>
-            </a:graphic>
-          </wp:inline>
-        </w:drawing>
-      </w:r>
-    </w:p>
-    <w:p>
-      <w:r>
-        <w:rPr>
-          <w:color w:val="777777"/>
-          <w:sz w:val="19"/>
-        </w:rPr>
-        <w:t>Why the abdomen belongs in this case. The inferior vena cava crosses a pressure boundary at the diaphragm, so the pressure surrounding it changes abruptly between the abdominal and thoracic compartments. A moderate rise in intra-abdominal pressure can compress the abdominal venous reservoir, increase upstream pressure and augment venous return if that rise exceeds the accompanying increase in right atrial pressure. With greater abdominal pressure, however, external compression can reduce IVC transmural pressure, create a flow-limiting segment or collapse, and decrease venous return. The same increase in abdominal pressure can therefore help or hinder flow depending on the pressure relationship across the caval segment, which I8 develops in full.</w:t>
-      </w:r>
-    </w:p>
-    <w:p>
-      <w:r>
-        <w:rPr>
-          <w:i/>
-          <w:color w:val="C0392B"/>
-          <w:sz w:val="19"/>
-        </w:rPr>
-        <w:t>[Layout note: figure shown small here. On the web it is currently capped at 640px wide. Say if you want it smaller/larger, moved, cropped, or replaced.]</w:t>
-      </w:r>
-    </w:p>
-    <w:p>
-      <w:r>
-        <w:drawing>
-          <wp:inline xmlns:a="http://schemas.openxmlformats.org/drawingml/2006/main" xmlns:pic="http://schemas.openxmlformats.org/drawingml/2006/picture">
-            <wp:extent cx="2834640" cy="1461864"/>
-            <wp:docPr id="5" name="Picture 5"/>
             <wp:cNvGraphicFramePr>
               <a:graphicFrameLocks noChangeAspect="1"/>
             </wp:cNvGraphicFramePr>
@@ -572,7 +527,7 @@
                     <pic:cNvPicPr/>
                   </pic:nvPicPr>
                   <pic:blipFill>
-                    <a:blip r:embed="rId13"/>
+                    <a:blip r:embed="rId12"/>
                     <a:stretch>
                       <a:fillRect/>
                     </a:stretch>
@@ -597,7 +552,7 @@
           <w:color w:val="777777"/>
           <w:sz w:val="19"/>
         </w:rPr>
-        <w:t>An anatomically detailed version of the same two-panel argument, showing the thoracic and abdominal compartments either side of the diaphragm and labelling the external pressure acting on each (pleural pressure above, intra-abdominal pressure below). In the figure, P_RA denotes RAP and P_msf denotes Pms. Drawn by Gustavo García Chávez for this module.</w:t>
+        <w:t>Why the abdomen belongs in this case. The inferior vena cava crosses a pressure boundary at the diaphragm, so the pressure surrounding it changes abruptly between the abdominal and thoracic compartments. A moderate rise in intra-abdominal pressure can compress the abdominal venous reservoir, increase upstream pressure and augment venous return if that rise exceeds the accompanying increase in right atrial pressure. With greater abdominal pressure, however, external compression can reduce IVC transmural pressure, create a flow-limiting segment or collapse, and decrease venous return. The same increase in abdominal pressure can therefore help or hinder flow depending on the pressure relationship across the caval segment, which I8 develops in full. In the figure, P_RA denotes RAP and P_msf denotes Pms. Drawn by Gustavo García Chávez for this module.</w:t>
       </w:r>
     </w:p>
     <w:p>
@@ -765,7 +720,7 @@
         <w:drawing>
           <wp:inline xmlns:a="http://schemas.openxmlformats.org/drawingml/2006/main" xmlns:pic="http://schemas.openxmlformats.org/drawingml/2006/picture">
             <wp:extent cx="2834640" cy="2834640"/>
-            <wp:docPr id="6" name="Picture 6"/>
+            <wp:docPr id="5" name="Picture 5"/>
             <wp:cNvGraphicFramePr>
               <a:graphicFrameLocks noChangeAspect="1"/>
             </wp:cNvGraphicFramePr>
@@ -777,7 +732,7 @@
                     <pic:cNvPicPr/>
                   </pic:nvPicPr>
                   <pic:blipFill>
-                    <a:blip r:embed="rId14"/>
+                    <a:blip r:embed="rId13"/>
                     <a:stretch>
                       <a:fillRect/>
                     </a:stretch>
@@ -868,7 +823,7 @@
         <w:drawing>
           <wp:inline xmlns:a="http://schemas.openxmlformats.org/drawingml/2006/main" xmlns:pic="http://schemas.openxmlformats.org/drawingml/2006/picture">
             <wp:extent cx="2834640" cy="2834640"/>
-            <wp:docPr id="7" name="Picture 7"/>
+            <wp:docPr id="6" name="Picture 6"/>
             <wp:cNvGraphicFramePr>
               <a:graphicFrameLocks noChangeAspect="1"/>
             </wp:cNvGraphicFramePr>
@@ -880,7 +835,7 @@
                     <pic:cNvPicPr/>
                   </pic:nvPicPr>
                   <pic:blipFill>
-                    <a:blip r:embed="rId15"/>
+                    <a:blip r:embed="rId14"/>
                     <a:stretch>
                       <a:fillRect/>
                     </a:stretch>
@@ -923,7 +878,7 @@
         <w:drawing>
           <wp:inline xmlns:a="http://schemas.openxmlformats.org/drawingml/2006/main" xmlns:pic="http://schemas.openxmlformats.org/drawingml/2006/picture">
             <wp:extent cx="2834640" cy="1891110"/>
-            <wp:docPr id="8" name="Picture 8"/>
+            <wp:docPr id="7" name="Picture 7"/>
             <wp:cNvGraphicFramePr>
               <a:graphicFrameLocks noChangeAspect="1"/>
             </wp:cNvGraphicFramePr>
@@ -935,7 +890,7 @@
                     <pic:cNvPicPr/>
                   </pic:nvPicPr>
                   <pic:blipFill>
-                    <a:blip r:embed="rId16"/>
+                    <a:blip r:embed="rId15"/>
                     <a:stretch>
                       <a:fillRect/>
                     </a:stretch>

</xml_diff>